<commit_message>
report: qualify Jul-2026 delinquency record horizon
Clarify that the 7.8% rate is the maximum within the IDC's common-component calculation horizon; Aug-2026 is already available for the standalone series.
</commit_message>
<xml_diff>
--- a/outputs/report/update-202609/idc-update-202609.docx
+++ b/outputs/report/update-202609/idc-update-202609.docx
@@ -1255,7 +1255,7 @@
           <w:b w:val="0"/>
           <w:i w:val="0"/>
         </w:rPr>
-        <w:t>. A taxa bruta atingiu o maior nível do histórico disponível e respondeu pela alta mensal do IDC.</w:t>
+        <w:t>. A taxa bruta atingiu o maior nível no horizonte calculável do IDC e respondeu pela alta mensal do índice.</w:t>
       </w:r>
     </w:p>
     <w:p>
@@ -1644,7 +1644,7 @@
           <w:b w:val="0"/>
           <w:i w:val="0"/>
         </w:rPr>
-        <w:t xml:space="preserve"> evidencia que a alta mais recente refletiu o avanço de I para seu máximo histórico; C permaneceu no máximo da amostra, enquanto Q recuou.</w:t>
+        <w:t xml:space="preserve"> evidencia que a alta mais recente refletiu o avanço de I para seu máximo no horizonte calculável do IDC; C permaneceu no máximo da amostra, enquanto Q recuou.</w:t>
       </w:r>
     </w:p>
     <w:p>

</xml_diff>

<commit_message>
report: rename credit quality component to costly credit share
</commit_message>
<xml_diff>
--- a/outputs/report/update-202609/idc-update-202609.docx
+++ b/outputs/report/update-202609/idc-update-202609.docx
@@ -902,7 +902,7 @@
                 <w:i w:val="0"/>
                 <w:sz w:val="21"/>
               </w:rPr>
-              <w:t>Q — Participação das modalidades onerosas no crédito livre PF</w:t>
+              <w:t>Q — Participação do crédito oneroso no crédito livre PF</w:t>
             </w:r>
           </w:p>
         </w:tc>
@@ -1275,7 +1275,7 @@
           <w:b w:val="0"/>
           <w:i w:val="0"/>
         </w:rPr>
-        <w:t xml:space="preserve">Qualidade do crédito (Q) caiu de </w:t>
+        <w:t xml:space="preserve">Participação do crédito oneroso (Q) caiu de </w:t>
       </w:r>
       <w:r>
         <w:rPr>
@@ -1708,7 +1708,7 @@
           <w:b w:val="0"/>
           <w:i w:val="0"/>
         </w:rPr>
-        <w:t xml:space="preserve">Sobre o IDC. O Índice de Desconforto de Crédito (IDC) é construído a partir de três séries do Sistema Gerenciador de Séries Temporais (SGS) do Banco Central do Brasil: comprometimento de renda das famílias com o serviço da dívida (SGS 29034), inadimplência da carteira de crédito livre PF — atrasos superiores a 90 dias (SGS 21112) — e participação das modalidades onerosas (cheque especial, SGS 20573; crédito pessoal não consignado, SGS 20574; cartão de crédito rotativo, SGS 20587; cartão de crédito parcelado, SGS 20588) no total do crédito livre para pessoa física (SGS 20570). Cada componente é normalizado pelo método min-max com janela expansiva, a partir de mar-2011; o índice é exibido a partir de jan-2014, após o período de aquecimento da janela, e corresponde à média simples dos três componentes normalizados, contido no intervalo [0, 1]. Por construção, o IDC mede a posição relativa do mês corrente em relação ao histórico observado pelo índice. O relatório de divulgação está disponível em </w:t>
+        <w:t xml:space="preserve">Sobre o IDC. O Índice de Desconforto de Crédito (IDC) é construído a partir de três séries do Sistema Gerenciador de Séries Temporais (SGS) do Banco Central do Brasil: comprometimento de renda das famílias com o serviço da dívida (SGS 29034), inadimplência da carteira de crédito livre PF — atrasos superiores a 90 dias (SGS 21112) — e participação do crédito oneroso, definida como a parcela do saldo total de crédito livre para pessoa física (SGS 20570) nas modalidades cheque especial (SGS 20573), crédito pessoal não consignado (SGS 20574), cartão de crédito rotativo (SGS 20587) e cartão de crédito parcelado (SGS 20588). Cada componente é normalizado pelo método min-max com janela expansiva, a partir de mar-2011; o índice é exibido a partir de jan-2014, após o período de aquecimento da janela, e corresponde à média simples dos três componentes normalizados, contido no intervalo [0, 1]. Por construção, o IDC mede a posição relativa do mês corrente em relação ao histórico observado pelo índice. O relatório de divulgação está disponível em </w:t>
       </w:r>
       <w:hyperlink r:id="rId16">
         <w:r>

</xml_diff>